<commit_message>
Correct shadow deployment documentation and record v0.18.0 acceptance
</commit_message>
<xml_diff>
--- a/docs/manuals/02_ETIS_Engineering_Studio_Installation_and_Administration_Guide.docx
+++ b/docs/manuals/02_ETIS_Engineering_Studio_Installation_and_Administration_Guide.docx
@@ -2014,7 +2014,7 @@
     </w:p>
     <w:p>
       <w:r>
-        <w:t>Production defaults remain legacy reasoning and legacy planning. Shadow validator/planner/selector/realizer evaluation remains internal and does not replace student-visible authority. This release introduces no PR5 authority transfer, database migration or course-model change.</w:t>
+        <w:t>Accepted production uses shadow/shadow evaluation with legacy student-visible authority. Shadow validator/planner/selector/realizer evaluation remains internal and does not replace student-visible authority. This release introduces no PR5 authority transfer, database migration or course-model change.</w:t>
       </w:r>
     </w:p>
     <w:p>
@@ -7111,7 +7111,7 @@
     </w:p>
     <w:p>
       <w:r>
-        <w:t>Verify /health version 0.18.0, reasoning_validation_mode legacy, review_planning_mode legacy, and /ready database_connected/migration_current. Record the actual merged SHA, successful workflow URL and image/revision before publication.</w:t>
+        <w:t>Verify /health version 0.18.0, reasoning_validation_mode shadow, review_planning_mode shadow, and /ready database_connected/migration_current. Record the actual merged SHA, successful workflow URL and image/revision before publication.</w:t>
       </w:r>
     </w:p>
     <w:p>

</xml_diff>